<commit_message>
creation check table quasiment ok
</commit_message>
<xml_diff>
--- a/renders/DC_JNZ_2026_without_tables_GLOBAL_transformed_generated.docx
+++ b/renders/DC_JNZ_2026_without_tables_GLOBAL_transformed_generated.docx
@@ -1039,6 +1039,11 @@
         <w:t>Expériences Professionnelles</w:t>
       </w:r>
     </w:p>
+    <w:p>
+      <w:pPr>
+        <w:pStyle w:val="DCNormal"/>
+      </w:pPr>
+    </w:p>
     <w:tbl>
       <w:tblPr>
         <w:tblStyle w:val="Grilledutableau"/>
@@ -1105,121 +1110,11 @@
             <w:pPr>
               <w:pStyle w:val="DCXPPoste"/>
             </w:pPr>
-          </w:p>
-        </w:tc>
-        <w:tc>
-          <w:tcPr>
-            <w:tcW w:type="dxa" w:w="2268"/>
-          </w:tcPr>
-          <w:p/>
-        </w:tc>
-      </w:tr>
-    </w:tbl>
-    <w:p>
-      <w:pPr>
-        <w:pStyle w:val="DCNormal"/>
-      </w:pPr>
-      <w:r>
-        <w:rPr>
-          <w:b/>
-        </w:rPr>
-        <w:t>Ingénieur d’étude CDI, mission de Data Engineer</w:t>
-      </w:r>
-    </w:p>
-    <w:p>
-      <w:pPr>
-        <w:pStyle w:val="DCNormal"/>
-      </w:pPr>
-      <w:r>
-        <w:rPr>
-          <w:b/>
-        </w:rPr>
-        <w:t xml:space="preserve">Contexte : </w:t>
-      </w:r>
-      <w:r>
-        <w:t>Ma première mission au sein d’EPSYL-ALCEN s’est déroulée dans le centre d’études et d’innovation d’ACC à Bruges. Dans le cadre de mises en place de process data automatisés, j’ai rejoint l’équipe data R&amp;D qui développe des pipelines et des applications de traitement de données pour la délivrer de manière dynamique et robuste aux autres services d’ingénierie.</w:t>
-      </w:r>
-    </w:p>
-    <w:p>
-      <w:pPr>
-        <w:pStyle w:val="DC1stbullet"/>
-      </w:pPr>
-      <w:r>
-        <w:t>Gestion de projets</w:t>
-      </w:r>
-    </w:p>
-    <w:p>
-      <w:pPr>
-        <w:pStyle w:val="DC2ndbullet"/>
-      </w:pPr>
-      <w:r>
-        <w:t>Recueil des besoins, des contraintes et spécifications</w:t>
-      </w:r>
-    </w:p>
-    <w:p>
-      <w:pPr>
-        <w:pStyle w:val="DC2ndbullet"/>
-      </w:pPr>
-      <w:r>
-        <w:t xml:space="preserve">Etude de faisabilité et proposition de solutions techniques </w:t>
-      </w:r>
-    </w:p>
-    <w:tbl>
-      <w:tblPr>
-        <w:tblStyle w:val="Grilledutableau"/>
-        <w:tblW w:type="auto" w:w="0"/>
-        <w:tblLook w:firstColumn="1" w:firstRow="1" w:lastColumn="0" w:lastRow="0" w:noHBand="0" w:noVBand="1" w:val="04A0"/>
-      </w:tblPr>
-      <w:tblGrid>
-        <w:gridCol w:w="4986"/>
-        <w:gridCol w:w="4986"/>
-      </w:tblGrid>
-      <w:tr>
-        <w:trPr>
-          <w:trHeight w:val="360"/>
-        </w:trPr>
-        <w:tc>
-          <w:tcPr>
-            <w:tcW w:type="dxa" w:w="7704"/>
-          </w:tcPr>
-          <w:p>
-            <w:pPr>
-              <w:pStyle w:val="DCXPTitle"/>
-            </w:pPr>
             <w:r>
-              <w:t>Rédaction de préconisations métiers, écriture des process, Formation des équipes</w:t>
-            </w:r>
-          </w:p>
-        </w:tc>
-        <w:tc>
-          <w:tcPr>
-            <w:tcW w:type="dxa" w:w="2268"/>
-          </w:tcPr>
-          <w:p/>
-        </w:tc>
-      </w:tr>
-      <w:tr>
-        <w:trPr>
-          <w:trHeight w:val="360"/>
-        </w:trPr>
-        <w:tc>
-          <w:tcPr>
-            <w:tcW w:type="dxa" w:w="7704"/>
-          </w:tcPr>
-          <w:p>
-            <w:pPr>
-              <w:pStyle w:val="DCXPPoste"/>
-            </w:pPr>
-            <w:r>
-              <w:t>Reportings</w:t>
-            </w:r>
-          </w:p>
-          <w:p>
-            <w:pPr>
-              <w:pStyle w:val="DCXPPoste"/>
-            </w:pPr>
-            <w:r>
-              <w:t>Collecte des données</w:t>
+              <w:rPr>
+                <w:b/>
+              </w:rPr>
+              <w:t>Ingénieur d’étude CDI, mission de Data Engineer</w:t>
             </w:r>
           </w:p>
         </w:tc>
@@ -1231,6 +1126,76 @@
         </w:tc>
       </w:tr>
     </w:tbl>
+    <w:p>
+      <w:pPr>
+        <w:pStyle w:val="DCNormal"/>
+      </w:pPr>
+      <w:r>
+        <w:rPr>
+          <w:b/>
+        </w:rPr>
+        <w:t xml:space="preserve">Contexte : </w:t>
+      </w:r>
+      <w:r>
+        <w:t>Ma première mission au sein d’EPSYL-ALCEN s’est déroulée dans le centre d’études et d’innovation d’ACC à Bruges. Dans le cadre de mises en place de process data automatisés, j’ai rejoint l’équipe data R&amp;D qui développe des pipelines et des applications de traitement de données pour la délivrer de manière dynamique et robuste aux autres services d’ingénierie.</w:t>
+      </w:r>
+    </w:p>
+    <w:p>
+      <w:pPr>
+        <w:pStyle w:val="DC1stbullet"/>
+      </w:pPr>
+      <w:r>
+        <w:t>Gestion de projets</w:t>
+      </w:r>
+    </w:p>
+    <w:p>
+      <w:pPr>
+        <w:pStyle w:val="DC2ndbullet"/>
+      </w:pPr>
+      <w:r>
+        <w:t>Recueil des besoins, des contraintes et spécifications</w:t>
+      </w:r>
+    </w:p>
+    <w:p>
+      <w:pPr>
+        <w:pStyle w:val="DC2ndbullet"/>
+      </w:pPr>
+      <w:r>
+        <w:t xml:space="preserve">Etude de faisabilité et proposition de solutions techniques </w:t>
+      </w:r>
+    </w:p>
+    <w:p>
+      <w:pPr>
+        <w:pStyle w:val="DC2ndbullet"/>
+      </w:pPr>
+      <w:r>
+        <w:t>Communication avec les équipes, organisation des points d’avancement</w:t>
+      </w:r>
+    </w:p>
+    <w:p>
+      <w:pPr>
+        <w:pStyle w:val="DC2ndbullet"/>
+      </w:pPr>
+      <w:r>
+        <w:t>Rédaction de préconisations métiers, écriture des process, Formation des équipes</w:t>
+      </w:r>
+    </w:p>
+    <w:p>
+      <w:pPr>
+        <w:pStyle w:val="DC2ndbullet"/>
+      </w:pPr>
+      <w:r>
+        <w:t>Reportings</w:t>
+      </w:r>
+    </w:p>
+    <w:p>
+      <w:pPr>
+        <w:pStyle w:val="DC1stbullet"/>
+      </w:pPr>
+      <w:r>
+        <w:t>Collecte des données</w:t>
+      </w:r>
+    </w:p>
     <w:p>
       <w:pPr>
         <w:pStyle w:val="DC2ndbullet"/>
@@ -1592,73 +1557,38 @@
         <w:t xml:space="preserve">Etude et proposition de solutions techniques </w:t>
       </w:r>
     </w:p>
-    <w:tbl>
-      <w:tblPr>
-        <w:tblStyle w:val="Grilledutableau"/>
-        <w:tblW w:type="auto" w:w="0"/>
-        <w:tblLook w:firstColumn="1" w:firstRow="1" w:lastColumn="0" w:lastRow="0" w:noHBand="0" w:noVBand="1" w:val="04A0"/>
-      </w:tblPr>
-      <w:tblGrid>
-        <w:gridCol w:w="4986"/>
-        <w:gridCol w:w="4986"/>
-      </w:tblGrid>
-      <w:tr>
-        <w:trPr>
-          <w:trHeight w:val="360"/>
-        </w:trPr>
-        <w:tc>
-          <w:tcPr>
-            <w:tcW w:type="dxa" w:w="7704"/>
-          </w:tcPr>
-          <w:p>
-            <w:pPr>
-              <w:pStyle w:val="DCXPTitle"/>
-            </w:pPr>
-            <w:r>
-              <w:t>Communication avec les équipes, organisation des réunions</w:t>
-            </w:r>
-          </w:p>
-        </w:tc>
-        <w:tc>
-          <w:tcPr>
-            <w:tcW w:type="dxa" w:w="2268"/>
-          </w:tcPr>
-          <w:p/>
-        </w:tc>
-      </w:tr>
-      <w:tr>
-        <w:trPr>
-          <w:trHeight w:val="360"/>
-        </w:trPr>
-        <w:tc>
-          <w:tcPr>
-            <w:tcW w:type="dxa" w:w="7704"/>
-          </w:tcPr>
-          <w:p>
-            <w:pPr>
-              <w:pStyle w:val="DCXPPoste"/>
-            </w:pPr>
-            <w:r>
-              <w:t xml:space="preserve">Rédaction de préconisations métiers </w:t>
-            </w:r>
-          </w:p>
-          <w:p>
-            <w:pPr>
-              <w:pStyle w:val="DCXPPoste"/>
-            </w:pPr>
-            <w:r>
-              <w:t>Reportings</w:t>
-            </w:r>
-          </w:p>
-        </w:tc>
-        <w:tc>
-          <w:tcPr>
-            <w:tcW w:type="dxa" w:w="2268"/>
-          </w:tcPr>
-          <w:p/>
-        </w:tc>
-      </w:tr>
-    </w:tbl>
+    <w:p>
+      <w:pPr>
+        <w:pStyle w:val="DC2ndbullet"/>
+      </w:pPr>
+      <w:r>
+        <w:t>Construction et mise à jour du Kanban de projet, Méthodologie Agile</w:t>
+      </w:r>
+    </w:p>
+    <w:p>
+      <w:pPr>
+        <w:pStyle w:val="DC2ndbullet"/>
+      </w:pPr>
+      <w:r>
+        <w:t>Communication avec les équipes, organisation des réunions</w:t>
+      </w:r>
+    </w:p>
+    <w:p>
+      <w:pPr>
+        <w:pStyle w:val="DC2ndbullet"/>
+      </w:pPr>
+      <w:r>
+        <w:t xml:space="preserve">Rédaction de préconisations métiers </w:t>
+      </w:r>
+    </w:p>
+    <w:p>
+      <w:pPr>
+        <w:pStyle w:val="DC2ndbullet"/>
+      </w:pPr>
+      <w:r>
+        <w:t>Reportings</w:t>
+      </w:r>
+    </w:p>
     <w:p>
       <w:pPr>
         <w:pStyle w:val="DC1stbullet"/>
@@ -2026,73 +1956,38 @@
         <w:t xml:space="preserve"> qui est une entreprise de conception et fabrication de menuiseries afin de prendre en charge l’ensemble des projets data. J’ai notamment travaillé avec les équipes R&amp;D sur le traitement des données techniques liées aux différents produits.</w:t>
       </w:r>
     </w:p>
-    <w:tbl>
-      <w:tblPr>
-        <w:tblStyle w:val="Grilledutableau"/>
-        <w:tblW w:type="auto" w:w="0"/>
-        <w:tblLook w:firstColumn="1" w:firstRow="1" w:lastColumn="0" w:lastRow="0" w:noHBand="0" w:noVBand="1" w:val="04A0"/>
-      </w:tblPr>
-      <w:tblGrid>
-        <w:gridCol w:w="4986"/>
-        <w:gridCol w:w="4986"/>
-      </w:tblGrid>
-      <w:tr>
-        <w:trPr>
-          <w:trHeight w:val="360"/>
-        </w:trPr>
-        <w:tc>
-          <w:tcPr>
-            <w:tcW w:type="dxa" w:w="7704"/>
-          </w:tcPr>
-          <w:p>
-            <w:pPr>
-              <w:pStyle w:val="DCXPTitle"/>
-            </w:pPr>
-            <w:r>
-              <w:t>Recueil des besoins</w:t>
-            </w:r>
-          </w:p>
-        </w:tc>
-        <w:tc>
-          <w:tcPr>
-            <w:tcW w:type="dxa" w:w="2268"/>
-          </w:tcPr>
-          <w:p/>
-        </w:tc>
-      </w:tr>
-      <w:tr>
-        <w:trPr>
-          <w:trHeight w:val="360"/>
-        </w:trPr>
-        <w:tc>
-          <w:tcPr>
-            <w:tcW w:type="dxa" w:w="7704"/>
-          </w:tcPr>
-          <w:p>
-            <w:pPr>
-              <w:pStyle w:val="DCXPPoste"/>
-            </w:pPr>
-            <w:r>
-              <w:t>Participation au cahier des charges avec les métiers</w:t>
-            </w:r>
-          </w:p>
-          <w:p>
-            <w:pPr>
-              <w:pStyle w:val="DCXPPoste"/>
-            </w:pPr>
-            <w:r>
-              <w:t>Analyse de faisabilité et préconisations</w:t>
-            </w:r>
-          </w:p>
-        </w:tc>
-        <w:tc>
-          <w:tcPr>
-            <w:tcW w:type="dxa" w:w="2268"/>
-          </w:tcPr>
-          <w:p/>
-        </w:tc>
-      </w:tr>
-    </w:tbl>
+    <w:p>
+      <w:pPr>
+        <w:pStyle w:val="DC1stbullet"/>
+      </w:pPr>
+      <w:r>
+        <w:t>Gestion de projets</w:t>
+      </w:r>
+    </w:p>
+    <w:p>
+      <w:pPr>
+        <w:pStyle w:val="DC2ndbullet"/>
+      </w:pPr>
+      <w:r>
+        <w:t>Recueil des besoins</w:t>
+      </w:r>
+    </w:p>
+    <w:p>
+      <w:pPr>
+        <w:pStyle w:val="DC2ndbullet"/>
+      </w:pPr>
+      <w:r>
+        <w:t>Participation au cahier des charges avec les métiers</w:t>
+      </w:r>
+    </w:p>
+    <w:p>
+      <w:pPr>
+        <w:pStyle w:val="DC2ndbullet"/>
+      </w:pPr>
+      <w:r>
+        <w:t>Analyse de faisabilité et préconisations</w:t>
+      </w:r>
+    </w:p>
     <w:p>
       <w:pPr>
         <w:pStyle w:val="DC2ndbullet"/>
@@ -2214,73 +2109,38 @@
         <w:t>Données techniques produits</w:t>
       </w:r>
     </w:p>
-    <w:tbl>
-      <w:tblPr>
-        <w:tblStyle w:val="Grilledutableau"/>
-        <w:tblW w:type="auto" w:w="0"/>
-        <w:tblLook w:firstColumn="1" w:firstRow="1" w:lastColumn="0" w:lastRow="0" w:noHBand="0" w:noVBand="1" w:val="04A0"/>
-      </w:tblPr>
-      <w:tblGrid>
-        <w:gridCol w:w="4986"/>
-        <w:gridCol w:w="4986"/>
-      </w:tblGrid>
-      <w:tr>
-        <w:trPr>
-          <w:trHeight w:val="360"/>
-        </w:trPr>
-        <w:tc>
-          <w:tcPr>
-            <w:tcW w:type="dxa" w:w="7704"/>
-          </w:tcPr>
-          <w:p>
-            <w:pPr>
-              <w:pStyle w:val="DCXPTitle"/>
-            </w:pPr>
-            <w:r>
-              <w:t>Gammes</w:t>
-            </w:r>
-          </w:p>
-        </w:tc>
-        <w:tc>
-          <w:tcPr>
-            <w:tcW w:type="dxa" w:w="2268"/>
-          </w:tcPr>
-          <w:p/>
-        </w:tc>
-      </w:tr>
-      <w:tr>
-        <w:trPr>
-          <w:trHeight w:val="360"/>
-        </w:trPr>
-        <w:tc>
-          <w:tcPr>
-            <w:tcW w:type="dxa" w:w="7704"/>
-          </w:tcPr>
-          <w:p>
-            <w:pPr>
-              <w:pStyle w:val="DCXPPoste"/>
-            </w:pPr>
-            <w:r>
-              <w:t>Nomenclatures…</w:t>
-            </w:r>
-          </w:p>
-          <w:p>
-            <w:pPr>
-              <w:pStyle w:val="DCXPPoste"/>
-            </w:pPr>
-            <w:r>
-              <w:t>Compréhension et interprétation</w:t>
-            </w:r>
-          </w:p>
-        </w:tc>
-        <w:tc>
-          <w:tcPr>
-            <w:tcW w:type="dxa" w:w="2268"/>
-          </w:tcPr>
-          <w:p/>
-        </w:tc>
-      </w:tr>
-    </w:tbl>
+    <w:p>
+      <w:pPr>
+        <w:pStyle w:val="DC4thbullet"/>
+      </w:pPr>
+      <w:r>
+        <w:t>Données commerciales sur ERP</w:t>
+      </w:r>
+    </w:p>
+    <w:p>
+      <w:pPr>
+        <w:pStyle w:val="DC4thbullet"/>
+      </w:pPr>
+      <w:r>
+        <w:t>Gammes</w:t>
+      </w:r>
+    </w:p>
+    <w:p>
+      <w:pPr>
+        <w:pStyle w:val="DC4thbullet"/>
+      </w:pPr>
+      <w:r>
+        <w:t>Nomenclatures…</w:t>
+      </w:r>
+    </w:p>
+    <w:p>
+      <w:pPr>
+        <w:pStyle w:val="DC2ndbullet"/>
+      </w:pPr>
+      <w:r>
+        <w:t>Compréhension et interprétation</w:t>
+      </w:r>
+    </w:p>
     <w:p>
       <w:pPr>
         <w:pStyle w:val="DC2ndbullet"/>

</xml_diff>

<commit_message>
paras vide in tables corrigé
</commit_message>
<xml_diff>
--- a/renders/DC_JNZ_2026_without_tables_GLOBAL_transformed_generated.docx
+++ b/renders/DC_JNZ_2026_without_tables_GLOBAL_transformed_generated.docx
@@ -1058,12 +1058,6 @@
               <w:pStyle w:val="DCXPPoste"/>
               <w:jc w:val="left"/>
             </w:pPr>
-          </w:p>
-          <w:p>
-            <w:pPr>
-              <w:pStyle w:val="DCXPPoste"/>
-              <w:jc w:val="left"/>
-            </w:pPr>
             <w:r>
               <w:rPr>
                 <w:b/>
@@ -1349,7 +1343,7 @@
     </w:p>
     <w:p>
       <w:pPr>
-        <w:pStyle w:val="DCNormal"/>
+        <w:pStyle w:val="DCXPBlueContent"/>
       </w:pPr>
       <w:r>
         <w:rPr>
@@ -1458,12 +1452,6 @@
               <w:pStyle w:val="DCXPPoste"/>
               <w:jc w:val="left"/>
             </w:pPr>
-          </w:p>
-          <w:p>
-            <w:pPr>
-              <w:pStyle w:val="DCXPPoste"/>
-              <w:jc w:val="left"/>
-            </w:pPr>
             <w:r>
               <w:rPr>
                 <w:b/>
@@ -1792,7 +1780,7 @@
     </w:p>
     <w:p>
       <w:pPr>
-        <w:pStyle w:val="DCNormal"/>
+        <w:pStyle w:val="DCXPBlueContent"/>
       </w:pPr>
       <w:r>
         <w:rPr>
@@ -1925,18 +1913,6 @@
               <w:pStyle w:val="DCXPPoste"/>
               <w:jc w:val="left"/>
             </w:pPr>
-          </w:p>
-          <w:p>
-            <w:pPr>
-              <w:pStyle w:val="DCXPPoste"/>
-              <w:jc w:val="left"/>
-            </w:pPr>
-          </w:p>
-          <w:p>
-            <w:pPr>
-              <w:pStyle w:val="DCXPPoste"/>
-              <w:jc w:val="left"/>
-            </w:pPr>
             <w:r>
               <w:rPr>
                 <w:b/>
@@ -2341,7 +2317,7 @@
     </w:p>
     <w:p>
       <w:pPr>
-        <w:pStyle w:val="DCNormal"/>
+        <w:pStyle w:val="DCXPBlueContent"/>
       </w:pPr>
       <w:r>
         <w:rPr>
@@ -2555,7 +2531,7 @@
     </w:p>
     <w:p>
       <w:pPr>
-        <w:pStyle w:val="DCNormal"/>
+        <w:pStyle w:val="DCXPBlueContent"/>
       </w:pPr>
       <w:r>
         <w:rPr>
@@ -2673,18 +2649,6 @@
               <w:pStyle w:val="DCXPPoste"/>
               <w:jc w:val="left"/>
             </w:pPr>
-          </w:p>
-          <w:p>
-            <w:pPr>
-              <w:pStyle w:val="DCXPPoste"/>
-              <w:jc w:val="left"/>
-            </w:pPr>
-          </w:p>
-          <w:p>
-            <w:pPr>
-              <w:pStyle w:val="DCXPPoste"/>
-              <w:jc w:val="left"/>
-            </w:pPr>
             <w:r>
               <w:rPr>
                 <w:b/>
@@ -2704,12 +2668,6 @@
               <w:t>, Alternance</w:t>
             </w:r>
           </w:p>
-          <w:p>
-            <w:pPr>
-              <w:pStyle w:val="DCXPPoste"/>
-              <w:jc w:val="left"/>
-            </w:pPr>
-          </w:p>
         </w:tc>
         <w:tc>
           <w:tcPr>
@@ -2819,7 +2777,7 @@
     </w:p>
     <w:p>
       <w:pPr>
-        <w:pStyle w:val="DCNormal"/>
+        <w:pStyle w:val="DCXPBlueContent"/>
       </w:pPr>
       <w:r>
         <w:rPr>

</xml_diff>

<commit_message>
first shot tables education
</commit_message>
<xml_diff>
--- a/renders/DC_JNZ_2026_without_tables_GLOBAL_transformed_generated.docx
+++ b/renders/DC_JNZ_2026_without_tables_GLOBAL_transformed_generated.docx
@@ -943,6 +943,14 @@
       <w:pPr>
         <w:pStyle w:val="DCNormal"/>
       </w:pPr>
+    </w:p>
+    <w:p>
+      <w:pPr>
+        <w:pStyle w:val="DCT1Sections"/>
+      </w:pPr>
+      <w:r>
+        <w:t>Langues</w:t>
+      </w:r>
     </w:p>
     <w:p>
       <w:pPr>
@@ -15114,7 +15122,7 @@
     <w:next w:val="DCNormal"/>
     <w:link w:val="DCT1SectionsCar"/>
     <w:qFormat/>
-    <w:rsid w:val="00C87908"/>
+    <w:rsid w:val="00476156"/>
     <w:pPr>
       <w:spacing w:before="120" w:after="120" w:line="240" w:lineRule="auto"/>
       <w:ind w:left="567"/>
@@ -15124,6 +15132,7 @@
       <w:rFonts w:ascii="Arial" w:eastAsiaTheme="majorEastAsia" w:hAnsi="Arial" w:cstheme="majorBidi"/>
       <w:b/>
       <w:bCs/>
+      <w:smallCaps/>
       <w:color w:val="538CD4"/>
       <w:sz w:val="32"/>
       <w:szCs w:val="28"/>
@@ -15131,19 +15140,17 @@
   </w:style>
   <w:style w:type="paragraph" w:customStyle="1" w:styleId="DC1stbullet">
     <w:name w:val="DC_1st_bullet"/>
-    <w:basedOn w:val="DCT1Sections"/>
+    <w:basedOn w:val="DCNormal"/>
     <w:qFormat/>
-    <w:rsid w:val="00F16470"/>
+    <w:rsid w:val="001E2384"/>
     <w:pPr>
-      <w:spacing w:before="0"/>
-      <w:ind w:left="0"/>
       <w:outlineLvl w:val="2"/>
     </w:pPr>
     <w:rPr>
+      <w:b/>
       <w:color w:val="EC7C2F"/>
       <w:sz w:val="24"/>
       <w:szCs w:val="26"/>
-      <w:lang w:val="fr-FR"/>
     </w:rPr>
   </w:style>
   <w:style w:type="paragraph" w:customStyle="1" w:styleId="DCTableBlueTitle">
@@ -15247,11 +15254,12 @@
     <w:name w:val="DC_T1_Sections Car"/>
     <w:basedOn w:val="Policepardfaut"/>
     <w:link w:val="DCT1Sections"/>
-    <w:rsid w:val="00C87908"/>
+    <w:rsid w:val="00476156"/>
     <w:rPr>
       <w:rFonts w:ascii="Arial" w:eastAsiaTheme="majorEastAsia" w:hAnsi="Arial" w:cstheme="majorBidi"/>
       <w:b/>
       <w:bCs/>
+      <w:smallCaps/>
       <w:color w:val="538CD4"/>
       <w:sz w:val="32"/>
       <w:szCs w:val="28"/>
@@ -15288,7 +15296,6 @@
       </w:pBdr>
       <w:ind w:left="993" w:hanging="426"/>
       <w:contextualSpacing/>
-      <w:jc w:val="both"/>
       <w:outlineLvl w:val="9"/>
     </w:pPr>
     <w:rPr>
@@ -15351,17 +15358,18 @@
   </w:style>
   <w:style w:type="paragraph" w:customStyle="1" w:styleId="DCXPTitle">
     <w:name w:val="DC_XP_Title"/>
-    <w:basedOn w:val="DCNormal"/>
+    <w:basedOn w:val="DCT1Sections"/>
     <w:qFormat/>
-    <w:rsid w:val="009E21FF"/>
+    <w:rsid w:val="00476156"/>
     <w:pPr>
       <w:spacing w:before="240"/>
       <w:ind w:left="57" w:right="57"/>
       <w:outlineLvl w:val="1"/>
     </w:pPr>
     <w:rPr>
+      <w:b w:val="0"/>
+      <w:smallCaps w:val="0"/>
       <w:color w:val="808080" w:themeColor="background1" w:themeShade="80"/>
-      <w:sz w:val="32"/>
       <w:szCs w:val="32"/>
     </w:rPr>
   </w:style>

</xml_diff>

<commit_message>
apply styles ok and paras empty treated
</commit_message>
<xml_diff>
--- a/renders/DC_JNZ_2026_without_tables_GLOBAL_transformed_generated.docx
+++ b/renders/DC_JNZ_2026_without_tables_GLOBAL_transformed_generated.docx
@@ -85,26 +85,6 @@
     </w:p>
     <w:p>
       <w:pPr>
-        <w:pStyle w:val="DCNormal"/>
-      </w:pPr>
-    </w:p>
-    <w:p>
-      <w:pPr>
-        <w:pStyle w:val="DCNormal"/>
-      </w:pPr>
-    </w:p>
-    <w:p>
-      <w:pPr>
-        <w:pStyle w:val="DCNormal"/>
-      </w:pPr>
-    </w:p>
-    <w:p>
-      <w:pPr>
-        <w:pStyle w:val="DCNormal"/>
-      </w:pPr>
-    </w:p>
-    <w:p>
-      <w:pPr>
         <w:pStyle w:val="DCHDC"/>
       </w:pPr>
       <w:r>
@@ -121,21 +101,6 @@
     </w:p>
     <w:p>
       <w:pPr>
-        <w:pStyle w:val="DCNormal"/>
-      </w:pPr>
-    </w:p>
-    <w:p>
-      <w:pPr>
-        <w:pStyle w:val="DCNormal"/>
-      </w:pPr>
-    </w:p>
-    <w:p>
-      <w:pPr>
-        <w:pStyle w:val="DCNormal"/>
-      </w:pPr>
-    </w:p>
-    <w:p>
-      <w:pPr>
         <w:pStyle w:val="DCHTrigramme"/>
       </w:pPr>
       <w:r>
@@ -177,31 +142,6 @@
         </w:rPr>
         <w:t>Python, SQL, PostgreSQL, DBT</w:t>
       </w:r>
-    </w:p>
-    <w:p>
-      <w:pPr>
-        <w:pStyle w:val="DCNormal"/>
-      </w:pPr>
-    </w:p>
-    <w:p>
-      <w:pPr>
-        <w:pStyle w:val="DCNormal"/>
-      </w:pPr>
-    </w:p>
-    <w:p>
-      <w:pPr>
-        <w:pStyle w:val="DCNormal"/>
-      </w:pPr>
-    </w:p>
-    <w:p>
-      <w:pPr>
-        <w:pStyle w:val="DCNormal"/>
-      </w:pPr>
-    </w:p>
-    <w:p>
-      <w:pPr>
-        <w:pStyle w:val="DCNormal"/>
-      </w:pPr>
     </w:p>
     <w:p>
       <w:pPr>
@@ -751,12 +691,7 @@
     </w:p>
     <w:p>
       <w:pPr>
-        <w:pStyle w:val="Titre2"/>
-      </w:pPr>
-    </w:p>
-    <w:p>
-      <w:pPr>
-        <w:pStyle w:val="Titre2"/>
+        <w:pStyle w:val="DCNormal"/>
       </w:pPr>
     </w:p>
     <w:p>
@@ -766,6 +701,11 @@
       <w:r>
         <w:t>Formation</w:t>
       </w:r>
+    </w:p>
+    <w:p>
+      <w:pPr>
+        <w:pStyle w:val="DCNormal"/>
+      </w:pPr>
     </w:p>
     <w:tbl>
       <w:tblPr>
@@ -830,12 +770,6 @@
               <w:t>Le Wagon Bordeaux</w:t>
             </w:r>
           </w:p>
-          <w:p>
-            <w:pPr>
-              <w:pStyle w:val="DCTableContent"/>
-              <w:jc w:val="left"/>
-            </w:pPr>
-          </w:p>
         </w:tc>
       </w:tr>
       <w:tr>
@@ -882,12 +816,6 @@
             <w:r>
               <w:t>ESCEN Bordeaux</w:t>
             </w:r>
-          </w:p>
-          <w:p>
-            <w:pPr>
-              <w:pStyle w:val="DCTableContent"/>
-              <w:jc w:val="left"/>
-            </w:pPr>
           </w:p>
         </w:tc>
       </w:tr>
@@ -936,12 +864,6 @@
               <w:t>ESCEN Bordeaux</w:t>
             </w:r>
           </w:p>
-          <w:p>
-            <w:pPr>
-              <w:pStyle w:val="DCTableContent"/>
-              <w:jc w:val="left"/>
-            </w:pPr>
-          </w:p>
         </w:tc>
       </w:tr>
       <w:tr>
@@ -989,12 +911,6 @@
               <w:t>IUT Bordeaux Montesquieu</w:t>
             </w:r>
           </w:p>
-          <w:p>
-            <w:pPr>
-              <w:pStyle w:val="DCTableContent"/>
-              <w:jc w:val="left"/>
-            </w:pPr>
-          </w:p>
         </w:tc>
       </w:tr>
     </w:tbl>
@@ -1005,16 +921,16 @@
     </w:p>
     <w:p>
       <w:pPr>
+        <w:pStyle w:val="DCT1Sections"/>
+      </w:pPr>
+      <w:r>
+        <w:t>Langues</w:t>
+      </w:r>
+    </w:p>
+    <w:p>
+      <w:pPr>
         <w:pStyle w:val="DCNormal"/>
       </w:pPr>
-    </w:p>
-    <w:p>
-      <w:pPr>
-        <w:pStyle w:val="DCT1Sections"/>
-      </w:pPr>
-      <w:r>
-        <w:t>Langues</w:t>
-      </w:r>
     </w:p>
     <w:tbl>
       <w:tblPr>
@@ -1049,7 +965,7 @@
               <w:jc w:val="left"/>
             </w:pPr>
             <w:r>
-              <w:t>Anglais :</w:t>
+              <w:t>Anglais</w:t>
             </w:r>
           </w:p>
         </w:tc>
@@ -1072,6 +988,11 @@
     </w:tbl>
     <w:p>
       <w:pPr>
+        <w:pStyle w:val="DCNormal"/>
+      </w:pPr>
+    </w:p>
+    <w:p>
+      <w:pPr>
         <w:pStyle w:val="DCT1Sections"/>
       </w:pPr>
       <w:r>
@@ -1080,11 +1001,6 @@
         </w:rPr>
         <w:t>Expériences Professionnelles</w:t>
       </w:r>
-    </w:p>
-    <w:p>
-      <w:pPr>
-        <w:pStyle w:val="DCNormal"/>
-      </w:pPr>
     </w:p>
     <w:p>
       <w:pPr>
@@ -1877,11 +1793,6 @@
       <w:r>
         <w:t>Entrainement de modèles ML, graphes prévisionnels</w:t>
       </w:r>
-    </w:p>
-    <w:p>
-      <w:pPr>
-        <w:pStyle w:val="DCNormal"/>
-      </w:pPr>
     </w:p>
     <w:p>
       <w:pPr>

</xml_diff>